<commit_message>
Editie 6 + 7 herzien in nieuwe grondtoon: 'tegenstander/blokkadekracht/poldergeest/smerigste stroom' vervangen door 'schakel-met-traagheid/remgewicht/consensus-modus/hoogste verborgen kosten'
</commit_message>
<xml_diff>
--- a/assets/downloads-editie-6/editie6_aflevering-00-brussel-als-variabele.docx
+++ b/assets/downloads-editie-6/editie6_aflevering-00-brussel-als-variabele.docx
@@ -20,15 +20,15 @@
           <w:i/>
           <w:iCs/>
         </w:rPr>
-        <w:t xml:space="preserve">Waarom de zwaarste tegenstander van een Nederlandse hervorming geen vetorecht heeft — zolang Nederland zijn eigen weging publiek durft te maken.</w:t>
-      </w:r>
-    </w:p>
-    <w:p>
-      <w:pPr>
-        <w:pStyle w:val="BodyText"/>
-      </w:pPr>
-      <w:r>
-        <w:t xml:space="preserve">In een eerdere weging van de tegenstand tegen Nova Democratia kreeg het Europese recht de hoogste blokkadescore: negenhonderd op duizend. Die score ging uit van een aanname die geen ingenieur lang zou tolereren. Een belasting werd behandeld als constante, terwijl zij in werkelijkheid een variabele is. De vraag of Nederland Brussel een betere weg kan voorschrijven, is niet retorisch. Zij heeft een feitelijk antwoord.</w:t>
+        <w:t xml:space="preserve">Waarom de zwaarste schakel-met-traagheid van een Nederlandse hervorming geen vetorecht heeft — zolang Nederland zijn eigen weging publiek durft te maken.</w:t>
+      </w:r>
+    </w:p>
+    <w:p>
+      <w:pPr>
+        <w:pStyle w:val="BodyText"/>
+      </w:pPr>
+      <w:r>
+        <w:t xml:space="preserve">In een eerdere weging van de traagheid tegen Nova Democratia kreeg het Europese recht de hoogste traagheidsscore: negenhonderd op duizend. Die score ging uit van een aanname die geen ingenieur lang zou tolereren. Een belasting werd behandeld als constante, terwijl zij in werkelijkheid een variabele is. De vraag of Nederland Brussel een betere weg kan voorschrijven, is niet retorisch. Zij heeft een feitelijk antwoord.</w:t>
       </w:r>
     </w:p>
     <w:p>
@@ -120,7 +120,7 @@
         <w:pStyle w:val="BodyText"/>
       </w:pPr>
       <w:r>
-        <w:t xml:space="preserve">De praktische consequentie is dat de bonden onbetwist het zwaartepunt van de Nederlandse tegenstand worden. Dat is een ander strategisch landschap dan eerder geschetst. Het maakt de pakketdeal met onderwijs, ambtenaren en publieke omroep, die in aflevering 3 werd voorgesteld, nog belangrijker dan toen werd aangenomen.</w:t>
+        <w:t xml:space="preserve">De praktische consequentie is dat de bonden onbetwist het zwaartepunt van de Nederlandse traagheid worden. Dat is een ander strategisch landschap dan eerder geschetst. Het maakt de pakketdeal met onderwijs, ambtenaren en publieke omroep, die in aflevering 3 werd voorgesteld, nog belangrijker dan toen werd aangenomen.</w:t>
       </w:r>
     </w:p>
     <w:p>

</xml_diff>